<commit_message>
paper: regenerate two-column docx with float spacing (table/figure margins)
</commit_message>
<xml_diff>
--- a/docs/paper/CoEval_twocolumn.docx
+++ b/docs/paper/CoEval_twocolumn.docx
@@ -315,9 +315,10 @@
     </w:p>
     <w:p>
       <w:pPr>
-        <w:rPr>
-          <w:sz w:val="4"/>
-          <w:szCs w:val="4"/>
+        <w:spacing w:before="120" w:after="120" w:line="120" w:lineRule="exact"/>
+        <w:rPr>
+          <w:sz w:val="12"/>
+          <w:szCs w:val="12"/>
         </w:rPr>
         <w:sectPr>
           <w:footerReference w:type="default" r:id="rId9"/>
@@ -2521,9 +2522,10 @@
     </w:p>
     <w:p>
       <w:pPr>
-        <w:rPr>
-          <w:sz w:val="4"/>
-          <w:szCs w:val="4"/>
+        <w:spacing w:before="120" w:after="120" w:line="120" w:lineRule="exact"/>
+        <w:rPr>
+          <w:sz w:val="12"/>
+          <w:szCs w:val="12"/>
         </w:rPr>
         <w:sectPr>
           <w:type w:val="continuous"/>
@@ -2628,9 +2630,10 @@
     </w:p>
     <w:p>
       <w:pPr>
-        <w:rPr>
-          <w:sz w:val="4"/>
-          <w:szCs w:val="4"/>
+        <w:spacing w:before="120" w:after="120" w:line="120" w:lineRule="exact"/>
+        <w:rPr>
+          <w:sz w:val="12"/>
+          <w:szCs w:val="12"/>
         </w:rPr>
         <w:sectPr>
           <w:type w:val="continuous"/>
@@ -3912,9 +3915,10 @@
     </w:p>
     <w:p>
       <w:pPr>
-        <w:rPr>
-          <w:sz w:val="4"/>
-          <w:szCs w:val="4"/>
+        <w:spacing w:before="120" w:after="120" w:line="120" w:lineRule="exact"/>
+        <w:rPr>
+          <w:sz w:val="12"/>
+          <w:szCs w:val="12"/>
         </w:rPr>
         <w:sectPr>
           <w:type w:val="continuous"/>
@@ -4663,9 +4667,10 @@
     </w:tbl>
     <w:p>
       <w:pPr>
-        <w:rPr>
-          <w:sz w:val="4"/>
-          <w:szCs w:val="4"/>
+        <w:spacing w:before="120" w:after="120" w:line="120" w:lineRule="exact"/>
+        <w:rPr>
+          <w:sz w:val="12"/>
+          <w:szCs w:val="12"/>
         </w:rPr>
         <w:sectPr>
           <w:type w:val="continuous"/>
@@ -5156,9 +5161,10 @@
     </w:p>
     <w:p>
       <w:pPr>
-        <w:rPr>
-          <w:sz w:val="4"/>
-          <w:szCs w:val="4"/>
+        <w:spacing w:before="120" w:after="120" w:line="120" w:lineRule="exact"/>
+        <w:rPr>
+          <w:sz w:val="12"/>
+          <w:szCs w:val="12"/>
         </w:rPr>
         <w:sectPr>
           <w:type w:val="continuous"/>
@@ -5889,9 +5895,10 @@
     </w:tbl>
     <w:p>
       <w:pPr>
-        <w:rPr>
-          <w:sz w:val="4"/>
-          <w:szCs w:val="4"/>
+        <w:spacing w:before="120" w:after="120" w:line="120" w:lineRule="exact"/>
+        <w:rPr>
+          <w:sz w:val="12"/>
+          <w:szCs w:val="12"/>
         </w:rPr>
         <w:sectPr>
           <w:type w:val="continuous"/>
@@ -6348,9 +6355,10 @@
     </w:p>
     <w:p>
       <w:pPr>
-        <w:rPr>
-          <w:sz w:val="4"/>
-          <w:szCs w:val="4"/>
+        <w:spacing w:before="120" w:after="120" w:line="120" w:lineRule="exact"/>
+        <w:rPr>
+          <w:sz w:val="12"/>
+          <w:szCs w:val="12"/>
         </w:rPr>
         <w:sectPr>
           <w:type w:val="continuous"/>
@@ -6904,9 +6912,10 @@
     </w:tbl>
     <w:p>
       <w:pPr>
-        <w:rPr>
-          <w:sz w:val="4"/>
-          <w:szCs w:val="4"/>
+        <w:spacing w:before="120" w:after="120" w:line="120" w:lineRule="exact"/>
+        <w:rPr>
+          <w:sz w:val="12"/>
+          <w:szCs w:val="12"/>
         </w:rPr>
         <w:sectPr>
           <w:type w:val="continuous"/>
@@ -7547,9 +7556,10 @@
     </w:p>
     <w:p>
       <w:pPr>
-        <w:rPr>
-          <w:sz w:val="4"/>
-          <w:szCs w:val="4"/>
+        <w:spacing w:before="120" w:after="120" w:line="120" w:lineRule="exact"/>
+        <w:rPr>
+          <w:sz w:val="12"/>
+          <w:szCs w:val="12"/>
         </w:rPr>
         <w:sectPr>
           <w:type w:val="continuous"/>
@@ -7748,9 +7758,10 @@
     </w:p>
     <w:p>
       <w:pPr>
-        <w:rPr>
-          <w:sz w:val="4"/>
-          <w:szCs w:val="4"/>
+        <w:spacing w:before="120" w:after="120" w:line="120" w:lineRule="exact"/>
+        <w:rPr>
+          <w:sz w:val="12"/>
+          <w:szCs w:val="12"/>
         </w:rPr>
         <w:sectPr>
           <w:type w:val="continuous"/>
@@ -8931,9 +8942,10 @@
     </w:p>
     <w:p>
       <w:pPr>
-        <w:rPr>
-          <w:sz w:val="4"/>
-          <w:szCs w:val="4"/>
+        <w:spacing w:before="120" w:after="120" w:line="120" w:lineRule="exact"/>
+        <w:rPr>
+          <w:sz w:val="12"/>
+          <w:szCs w:val="12"/>
         </w:rPr>
         <w:sectPr>
           <w:type w:val="continuous"/>
@@ -9595,9 +9607,10 @@
     </w:p>
     <w:p>
       <w:pPr>
-        <w:rPr>
-          <w:sz w:val="4"/>
-          <w:szCs w:val="4"/>
+        <w:spacing w:before="120" w:after="120" w:line="120" w:lineRule="exact"/>
+        <w:rPr>
+          <w:sz w:val="12"/>
+          <w:szCs w:val="12"/>
         </w:rPr>
         <w:sectPr>
           <w:type w:val="continuous"/>
@@ -11254,9 +11267,10 @@
     </w:p>
     <w:p>
       <w:pPr>
-        <w:rPr>
-          <w:sz w:val="4"/>
-          <w:szCs w:val="4"/>
+        <w:spacing w:before="120" w:after="120" w:line="120" w:lineRule="exact"/>
+        <w:rPr>
+          <w:sz w:val="12"/>
+          <w:szCs w:val="12"/>
         </w:rPr>
         <w:sectPr>
           <w:type w:val="continuous"/>
@@ -12124,9 +12138,10 @@
     </w:tbl>
     <w:p>
       <w:pPr>
-        <w:rPr>
-          <w:sz w:val="4"/>
-          <w:szCs w:val="4"/>
+        <w:spacing w:before="120" w:after="120" w:line="120" w:lineRule="exact"/>
+        <w:rPr>
+          <w:sz w:val="12"/>
+          <w:szCs w:val="12"/>
         </w:rPr>
         <w:sectPr>
           <w:type w:val="continuous"/>
@@ -14985,9 +15000,10 @@
     </w:p>
     <w:p>
       <w:pPr>
-        <w:rPr>
-          <w:sz w:val="4"/>
-          <w:szCs w:val="4"/>
+        <w:spacing w:before="120" w:after="120" w:line="120" w:lineRule="exact"/>
+        <w:rPr>
+          <w:sz w:val="12"/>
+          <w:szCs w:val="12"/>
         </w:rPr>
         <w:sectPr>
           <w:type w:val="continuous"/>
@@ -15111,9 +15127,10 @@
     </w:p>
     <w:p>
       <w:pPr>
-        <w:rPr>
-          <w:sz w:val="4"/>
-          <w:szCs w:val="4"/>
+        <w:spacing w:before="120" w:after="120" w:line="120" w:lineRule="exact"/>
+        <w:rPr>
+          <w:sz w:val="12"/>
+          <w:szCs w:val="12"/>
         </w:rPr>
         <w:sectPr>
           <w:type w:val="continuous"/>
@@ -15139,9 +15156,10 @@
     </w:p>
     <w:p>
       <w:pPr>
-        <w:rPr>
-          <w:sz w:val="4"/>
-          <w:szCs w:val="4"/>
+        <w:spacing w:before="120" w:after="120" w:line="120" w:lineRule="exact"/>
+        <w:rPr>
+          <w:sz w:val="12"/>
+          <w:szCs w:val="12"/>
         </w:rPr>
         <w:sectPr>
           <w:type w:val="continuous"/>
@@ -15263,9 +15281,10 @@
     </w:p>
     <w:p>
       <w:pPr>
-        <w:rPr>
-          <w:sz w:val="4"/>
-          <w:szCs w:val="4"/>
+        <w:spacing w:before="120" w:after="120" w:line="120" w:lineRule="exact"/>
+        <w:rPr>
+          <w:sz w:val="12"/>
+          <w:szCs w:val="12"/>
         </w:rPr>
         <w:sectPr>
           <w:type w:val="continuous"/>
@@ -15415,9 +15434,10 @@
     </w:p>
     <w:p>
       <w:pPr>
-        <w:rPr>
-          <w:sz w:val="4"/>
-          <w:szCs w:val="4"/>
+        <w:spacing w:before="120" w:after="120" w:line="120" w:lineRule="exact"/>
+        <w:rPr>
+          <w:sz w:val="12"/>
+          <w:szCs w:val="12"/>
         </w:rPr>
         <w:sectPr>
           <w:type w:val="continuous"/>
@@ -15862,9 +15882,10 @@
     </w:tbl>
     <w:p>
       <w:pPr>
-        <w:rPr>
-          <w:sz w:val="4"/>
-          <w:szCs w:val="4"/>
+        <w:spacing w:before="120" w:after="120" w:line="120" w:lineRule="exact"/>
+        <w:rPr>
+          <w:sz w:val="12"/>
+          <w:szCs w:val="12"/>
         </w:rPr>
         <w:sectPr>
           <w:type w:val="continuous"/>
@@ -17419,6 +17440,7 @@
     <w:pPr>
       <w:keepNext w:val="0"/>
       <w:spacing w:after="0" w:before="0" w:line="240" w:lineRule="auto"/>
+      <w:ind w:firstLine="288"/>
       <w:jc w:val="both"/>
     </w:pPr>
     <w:rPr>
@@ -28684,6 +28706,7 @@
     <w:pPr>
       <w:keepNext w:val="0"/>
       <w:spacing w:after="0" w:before="0" w:line="240" w:lineRule="auto"/>
+      <w:ind w:firstLine="0"/>
       <w:jc w:val="both"/>
     </w:pPr>
     <w:rPr>
@@ -28715,6 +28738,7 @@
     <w:pPr>
       <w:keepNext/>
       <w:spacing w:after="80" w:before="80"/>
+      <w:ind w:firstLine="0"/>
       <w:jc w:val="center"/>
     </w:pPr>
     <w:rPr>
@@ -28730,6 +28754,7 @@
     <w:pPr>
       <w:keepNext w:val="0"/>
       <w:spacing w:after="80" w:before="0"/>
+      <w:ind w:firstLine="0"/>
       <w:jc w:val="both"/>
     </w:pPr>
     <w:rPr>

</xml_diff>

<commit_message>
paper: regenerate two-column docx with in-column narrow-table placement
</commit_message>
<xml_diff>
--- a/docs/paper/CoEval_twocolumn.docx
+++ b/docs/paper/CoEval_twocolumn.docx
@@ -11320,22 +11320,6 @@
       <w:r>
         <w:t xml:space="preserve">unavailable or untrustworthy.</w:t>
       </w:r>
-    </w:p>
-    <w:p>
-      <w:pPr>
-        <w:spacing w:before="120" w:after="120" w:line="120" w:lineRule="exact"/>
-        <w:rPr>
-          <w:sz w:val="12"/>
-          <w:szCs w:val="12"/>
-        </w:rPr>
-        <w:sectPr>
-          <w:type w:val="continuous"/>
-          <w:pgSz w:h="15840" w:w="12240"/>
-          <w:pgMar w:bottom="1080" w:footer="720" w:gutter="0" w:header="720" w:left="1080" w:right="1080" w:top="1080"/>
-          <w:cols w:num="2" w:space="288" w:equalWidth="1"/>
-          <w:docGrid w:linePitch="360"/>
-        </w:sectPr>
-      </w:pPr>
     </w:p>
     <w:p>
       <w:pPr>
@@ -12192,22 +12176,6 @@
         </w:tc>
       </w:tr>
     </w:tbl>
-    <w:p>
-      <w:pPr>
-        <w:spacing w:before="120" w:after="120" w:line="120" w:lineRule="exact"/>
-        <w:rPr>
-          <w:sz w:val="12"/>
-          <w:szCs w:val="12"/>
-        </w:rPr>
-        <w:sectPr>
-          <w:type w:val="continuous"/>
-          <w:pgSz w:h="15840" w:w="12240"/>
-          <w:pgMar w:bottom="1080" w:footer="720" w:gutter="0" w:header="720" w:left="1080" w:right="1080" w:top="1080"/>
-          <w:cols w:num="1" w:space="288"/>
-          <w:docGrid w:linePitch="360"/>
-        </w:sectPr>
-      </w:pPr>
-    </w:p>
     <w:bookmarkEnd w:id="39"/>
     <w:bookmarkEnd w:id="40"/>
     <w:bookmarkStart w:id="41" w:name="discussion"/>

</xml_diff>